<commit_message>
Add validated GM-only AFNI-inspired despiking
Adds optional pre-ICA despiking to CICADA using a conservative GM-only,
AFNI-inspired -NEW / -localedit approach.

Key changes:
- Adds validated cut2=6 despiking before MELODIC when enabled.
- Restricts edits to GM voxels and preserves non-GM data unchanged.
- Uses local interpolation for extreme voxel-time outliers rather than
  censoring whole volumes.
- Adds despiking QC plots and volume-level QC output.
- Routes despiking through Auto_CICADA so fMRIPrep and example workflows
  use the same implementation.
- Adds the missing 9p comparison tag.
- Updates example documentation for the optional despiking workflow.

Validated on small-sample real-data test cases.
</commit_message>
<xml_diff>
--- a/CICADA_UserGuide.docx
+++ b/CICADA_UserGuide.docx
@@ -1,6 +1,6 @@
 
 <file path=word/document.xml><?xml version="1.0" encoding="utf-8"?>
-<w:document xmlns:wpc="http://schemas.microsoft.com/office/word/2010/wordprocessingCanvas" xmlns:cx="http://schemas.microsoft.com/office/drawing/2014/chartex" xmlns:cx1="http://schemas.microsoft.com/office/drawing/2015/9/8/chartex" xmlns:cx2="http://schemas.microsoft.com/office/drawing/2015/10/21/chartex" xmlns:cx3="http://schemas.microsoft.com/office/drawing/2016/5/9/chartex" xmlns:cx4="http://schemas.microsoft.com/office/drawing/2016/5/10/chartex" xmlns:cx5="http://schemas.microsoft.com/office/drawing/2016/5/11/chartex" xmlns:cx6="http://schemas.microsoft.com/office/drawing/2016/5/12/chartex" xmlns:cx7="http://schemas.microsoft.com/office/drawing/2016/5/13/chartex" xmlns:cx8="http://schemas.microsoft.com/office/drawing/2016/5/14/chartex" xmlns:mc="http://schemas.openxmlformats.org/markup-compatibility/2006" xmlns:m="http://schemas.openxmlformats.org/officeDocument/2006/math" xmlns:aink="http://schemas.microsoft.com/office/drawing/2016/ink" xmlns:am3d="http://schemas.microsoft.com/office/drawing/2017/model3d" xmlns:oel="http://schemas.microsoft.com/office/2019/extlst" xmlns:r="http://schemas.openxmlformats.org/officeDocument/2006/relationships" xmlns:wp14="http://schemas.microsoft.com/office/word/2010/wordprocessingDrawing" xmlns:wp="http://schemas.openxmlformats.org/drawingml/2006/wordprocessingDrawing" xmlns:wpg="http://schemas.microsoft.com/office/word/2010/wordprocessingGroup" xmlns:wpi="http://schemas.microsoft.com/office/word/2010/wordprocessingInk" xmlns:wps="http://schemas.microsoft.com/office/word/2010/wordprocessingShape" xmlns:o="urn:schemas-microsoft-com:office:office" xmlns:v="urn:schemas-microsoft-com:vml" xmlns:w10="urn:schemas-microsoft-com:office:word" xmlns:w="http://schemas.openxmlformats.org/wordprocessingml/2006/main" xmlns:w14="http://schemas.microsoft.com/office/word/2010/wordml" xmlns:w15="http://schemas.microsoft.com/office/word/2012/wordml" xmlns:w16cex="http://schemas.microsoft.com/office/word/2018/wordml/cex" xmlns:w16cid="http://schemas.microsoft.com/office/word/2016/wordml/cid" xmlns:w16="http://schemas.microsoft.com/office/word/2018/wordml" xmlns:w16sdtdh="http://schemas.microsoft.com/office/word/2020/wordml/sdtdatahash" xmlns:w16sdtfl="http://schemas.microsoft.com/office/word/2024/wordml/sdtformatlock" xmlns:w16se="http://schemas.microsoft.com/office/word/2015/wordml/symex" xmlns:w16du="http://schemas.microsoft.com/office/word/2023/wordml/word16du" xmlns:wne="http://schemas.microsoft.com/office/word/2006/wordml" mc:Ignorable="w14 w15 w16se w16cid w16 w16cex w16sdtdh w16sdtfl w16du wp14">
+<w:document xmlns:wpc="http://schemas.microsoft.com/office/word/2010/wordprocessingCanvas" xmlns:cx="http://schemas.microsoft.com/office/drawing/2014/chartex" xmlns:cx1="http://schemas.microsoft.com/office/drawing/2015/9/8/chartex" xmlns:cx2="http://schemas.microsoft.com/office/drawing/2015/10/21/chartex" xmlns:cx3="http://schemas.microsoft.com/office/drawing/2016/5/9/chartex" xmlns:cx4="http://schemas.microsoft.com/office/drawing/2016/5/10/chartex" xmlns:cx5="http://schemas.microsoft.com/office/drawing/2016/5/11/chartex" xmlns:cx6="http://schemas.microsoft.com/office/drawing/2016/5/12/chartex" xmlns:cx7="http://schemas.microsoft.com/office/drawing/2016/5/13/chartex" xmlns:cx8="http://schemas.microsoft.com/office/drawing/2016/5/14/chartex" xmlns:mc="http://schemas.openxmlformats.org/markup-compatibility/2006" xmlns:aink="http://schemas.microsoft.com/office/drawing/2016/ink" xmlns:am3d="http://schemas.microsoft.com/office/drawing/2017/model3d" xmlns:o="urn:schemas-microsoft-com:office:office" xmlns:oel="http://schemas.microsoft.com/office/2019/extlst" xmlns:r="http://schemas.openxmlformats.org/officeDocument/2006/relationships" xmlns:m="http://schemas.openxmlformats.org/officeDocument/2006/math" xmlns:v="urn:schemas-microsoft-com:vml" xmlns:wp14="http://schemas.microsoft.com/office/word/2010/wordprocessingDrawing" xmlns:wp="http://schemas.openxmlformats.org/drawingml/2006/wordprocessingDrawing" xmlns:w10="urn:schemas-microsoft-com:office:word" xmlns:w="http://schemas.openxmlformats.org/wordprocessingml/2006/main" xmlns:w14="http://schemas.microsoft.com/office/word/2010/wordml" xmlns:w15="http://schemas.microsoft.com/office/word/2012/wordml" xmlns:w16cex="http://schemas.microsoft.com/office/word/2018/wordml/cex" xmlns:w16cid="http://schemas.microsoft.com/office/word/2016/wordml/cid" xmlns:w16="http://schemas.microsoft.com/office/word/2018/wordml" xmlns:w16du="http://schemas.microsoft.com/office/word/2023/wordml/word16du" xmlns:w16sdtdh="http://schemas.microsoft.com/office/word/2020/wordml/sdtdatahash" xmlns:w16sdtfl="http://schemas.microsoft.com/office/word/2024/wordml/sdtformatlock" xmlns:w16se="http://schemas.microsoft.com/office/word/2015/wordml/symex" xmlns:wpg="http://schemas.microsoft.com/office/word/2010/wordprocessingGroup" xmlns:wpi="http://schemas.microsoft.com/office/word/2010/wordprocessingInk" xmlns:wne="http://schemas.microsoft.com/office/word/2006/wordml" xmlns:wps="http://schemas.microsoft.com/office/word/2010/wordprocessingShape" mc:Ignorable="w14 w15 w16se w16cid w16 w16cex w16sdtdh w16sdtfl w16du wp14">
   <w:body>
     <w:p>
       <w:pPr>
@@ -54,7 +54,7 @@
           <w:i/>
           <w:iCs/>
         </w:rPr>
-        <w:t>8</w:t>
+        <w:t>9</w:t>
       </w:r>
       <w:r>
         <w:rPr>
@@ -68,7 +68,7 @@
           <w:i/>
           <w:iCs/>
         </w:rPr>
-        <w:t>31</w:t>
+        <w:t>03</w:t>
       </w:r>
       <w:r>
         <w:rPr>
@@ -108,7 +108,6 @@
           <w:docPartUnique/>
         </w:docPartObj>
       </w:sdtPr>
-      <w:sdtEndPr/>
       <w:sdtContent>
         <w:p>
           <w:pPr>
@@ -2110,7 +2109,13 @@
         <w:rPr>
           <w:rFonts w:ascii="Times New Roman" w:hAnsi="Times New Roman" w:cs="Times New Roman"/>
         </w:rPr>
-        <w:t xml:space="preserve">: If you found data that you want to exclude from all analyses for sure, mark as an “exclude.” If you performed Manual CICADA on an image to correct IC classification, mark as an “adjusted.” The idea being that if some data is not sufficiently denoised by Automatic CICADA, a user could try to denoise it better with Manual CICADA. If successful, then the user can tell Group CICADA (via “adjusted” parameter) which data to use the Manual CICADA IC classification over the Automatic CICADA IC classification. </w:t>
+        <w:t>: If you found data that you want to exclude from all analyses for sure, mark as an “exclude.” If you performed Manual CICADA on an image to correct IC classification, mark as an “adjusted.” The idea being that if some data is not sufficiently denoised by Automatic CICADA, a user could try to denoise it better with Manual CICADA. If successful, then the user can tell Group CICADA (via “adjusted” parameter) which data to use the Manual CICADA IC classification over the Automatic CICADA IC</w:t>
+      </w:r>
+      <w:r>
+        <w:rPr>
+          <w:rFonts w:ascii="Times New Roman" w:hAnsi="Times New Roman" w:cs="Times New Roman"/>
+        </w:rPr>
+        <w:t xml:space="preserve"> classification. </w:t>
       </w:r>
     </w:p>
     <w:p>
@@ -2545,15 +2550,7 @@
       </w:r>
       <w:proofErr w:type="spellEnd"/>
       <w:r>
-        <w:t xml:space="preserve"> </w:t>
-      </w:r>
-      <w:proofErr w:type="spellStart"/>
-      <w:r>
-        <w:t>Matlab</w:t>
-      </w:r>
-      <w:proofErr w:type="spellEnd"/>
-      <w:r>
-        <w:t xml:space="preserve"> function must be able to successfully run </w:t>
+        <w:t xml:space="preserve"> Matlab function must be able to successfully run </w:t>
       </w:r>
       <w:proofErr w:type="spellStart"/>
       <w:r>
@@ -2572,7 +2569,10 @@
       </w:r>
       <w:proofErr w:type="spellEnd"/>
       <w:r>
-        <w:t xml:space="preserve"> script will attempt to fix these variables for the user automatically.  However, the correct set up may differ depending on the user, operating system configuration, or updates. The current methods can be referenced in the figure below (from the </w:t>
+        <w:t xml:space="preserve"> script will attempt to fix these variables for the user automatically.  However, the correct set up may differ depending on the</w:t>
+      </w:r>
+      <w:r>
+        <w:t xml:space="preserve"> user, operating system configuration, or updates. The current methods can be referenced in the figure below (from the </w:t>
       </w:r>
       <w:proofErr w:type="spellStart"/>
       <w:r>
@@ -2842,7 +2842,10 @@
       </w:r>
       <w:proofErr w:type="spellEnd"/>
       <w:r>
-        <w:t xml:space="preserve"> templates if those inputs are not supplied. Similarly, </w:t>
+        <w:t xml:space="preserve"> templates if t</w:t>
+      </w:r>
+      <w:r>
+        <w:t xml:space="preserve">hose inputs are not supplied. Similarly, </w:t>
       </w:r>
       <w:r>
         <w:rPr>
@@ -2851,7 +2854,10 @@
         <w:t>a task events file is optional, but highly recommended if working with task-based data</w:t>
       </w:r>
       <w:r>
-        <w:t>. Other optional inputs include the preprocessed anatomical file (does not have to be a T1), a MELODIC directory and flag (so a user can direct CICADA to a previous MELODIC folder instead of rerunning MELODIC), a compare file (an alternatively denoised file so a user can compare CICADA to it – will default to comparing to standard 8 parameter regression), and a tolerance value (default to 5; see Running Automatic CICADA following fMRIPrep preprocessing section).</w:t>
+        <w:t>. Other optional inputs include the preprocessed anatomical file (does not have to be a T1), a MELODIC directory and flag (so a user can direct CICADA to a previous MELODIC folder instead of rerunning MELODIC), a compare file (an alternatively denoised file so a user can compare CICADA to it – will default to comparing to standard 8 parameter regression), and a tolerance value (defa</w:t>
+      </w:r>
+      <w:r>
+        <w:t>ult to 5; see Running Automatic CICADA following fMRIPrep preprocessing section).</w:t>
       </w:r>
     </w:p>
     <w:p/>
@@ -3370,7 +3376,10 @@
       </w:r>
       <w:proofErr w:type="spellEnd"/>
       <w:r>
-        <w:t xml:space="preserve"> command is used, it should be applied to each folder for each image.  For example, at the Matlab command prompt:</w:t>
+        <w:t xml:space="preserve"> command is used, it should be applied to each folder for each image.  For example, at the Matlab comm</w:t>
+      </w:r>
+      <w:r>
+        <w:t>and prompt:</w:t>
       </w:r>
     </w:p>
     <w:p/>
@@ -3622,7 +3631,10 @@
       </w:r>
       <w:proofErr w:type="gramEnd"/>
       <w:r>
-        <w:t xml:space="preserve"> just set it to the same as the ‘</w:t>
+        <w:t xml:space="preserve"> just se</w:t>
+      </w:r>
+      <w:r>
+        <w:t>t it to the same as the ‘</w:t>
       </w:r>
       <w:proofErr w:type="spellStart"/>
       <w:r>
@@ -3660,7 +3672,10 @@
       </w:r>
       <w:proofErr w:type="gramEnd"/>
       <w:r>
-        <w:t xml:space="preserve"> “task-foodpics_run-01_events.tsv” (see Figure 6). Specifically, the file must have the following columns: “onset” (in seconds), “duration” (in seconds) and “</w:t>
+        <w:t xml:space="preserve"> “task-foodpics_run-01_events.tsv” (see Figure 6). Specifically, the file must have the following columns: “onset” (in second</w:t>
+      </w:r>
+      <w:r>
+        <w:t>s), “duration” (in seconds) and “</w:t>
       </w:r>
       <w:proofErr w:type="spellStart"/>
       <w:r>
@@ -3668,7 +3683,10 @@
       </w:r>
       <w:proofErr w:type="spellEnd"/>
       <w:r>
-        <w:t xml:space="preserve">” (naming for the different trial types, without spaces). If a task events file is provided, CICADA will use it to generate individually estimated HRF responses for each trial type and one combined estimated HRF response, to help capture ICs that are related to each trial type. Thus, if this can be applicable to a user’s task-design, it is highly suggested to be included. Task data can be block or event-related design. If the task data is an event-related design, the duration (in seconds) would have to be </w:t>
+        <w:t>” (naming for the different trial types, without spaces). If a task events file is provided, CICADA will use it to generate individually estimated HRF responses for each trial type and one combined estimated HRF response, to help capture ICs that are related to each trial type. Thus, if this can be applicable to a user’s task-design, it is highly suggested to be included. Task data can be block or event-related design. If the task data is an event-related design, t</w:t>
+      </w:r>
+      <w:r>
+        <w:t xml:space="preserve">he duration (in seconds) would have to be </w:t>
       </w:r>
       <w:r>
         <w:lastRenderedPageBreak/>
@@ -3694,7 +3712,10 @@
       </w:r>
       <w:proofErr w:type="spellEnd"/>
       <w:r>
-        <w:t xml:space="preserve"> to compare to standard 6-parameter, 8-parameter, 12-parameter… etc. denoising. See section on compare file tag options for more information. The input “tolerance” is the tolerance value to use during “ CICADA_2_AutoLabeling.m”. In short, tolerance relates to the maximum number of signal-probability-sorted ICs in a row that CICADA labels as noise before automatically labeling all other ICs also as noise. For more details on tolerance, see details in “</w:t>
+        <w:t xml:space="preserve"> to compare to standard 6-parameter, 8-parameter, 12-parameter… etc. denoising. See section on compare file tag options for more information. The input “tolerance” is the tolerance value to use during “ CICADA_2_AutoLabelin</w:t>
+      </w:r>
+      <w:r>
+        <w:t>g.m”. In short, tolerance relates to the maximum number of signal-probability-sorted ICs in a row that CICADA labels as noise before automatically labeling all other ICs also as noise. For more details on tolerance, see details in “</w:t>
       </w:r>
       <w:proofErr w:type="spellStart"/>
       <w:r>
@@ -3733,6 +3754,17 @@
       </w:r>
       <w:proofErr w:type="spellEnd"/>
       <w:r>
+        <w:t xml:space="preserve"> (in a manner inspired by AFNI 3dDespike -</w:t>
+      </w:r>
+      <w:proofErr w:type="spellStart"/>
+      <w:r>
+        <w:t>localedit</w:t>
+      </w:r>
+      <w:proofErr w:type="spellEnd"/>
+      <w:r>
+        <w:t xml:space="preserve"> -NEW)</w:t>
+      </w:r>
+      <w:r>
         <w:t xml:space="preserve"> of their fMRI data BEFORE everything else (before MELODIC IC decomposition). The idea being that this may help lightly denoise the data to help IC decomposition in better separating out neuronal signal ICs from noise ICs. In short, large movement spikes may often “bleed” into gray matter significantly, which can make it difficult for IC decomposition to properly separate out gray matter neuronal signal from noise. By </w:t>
       </w:r>
       <w:proofErr w:type="spellStart"/>
@@ -3741,7 +3773,10 @@
       </w:r>
       <w:proofErr w:type="spellEnd"/>
       <w:r>
-        <w:t xml:space="preserve"> the worse of the movement spikes first, hopefully this may also help better separate out signal from noise with MELODIC IC decomposition. Note, this was not used in the CICADA manuscript and has not been thoroughly tested. However, there is a chance that this may help particularly noisy data. The default is to not </w:t>
+        <w:t xml:space="preserve"> the worse of the movement spikes first, hopefully this may also help better sepa</w:t>
+      </w:r>
+      <w:r>
+        <w:t xml:space="preserve">rate out signal from noise with MELODIC IC decomposition. Note, this was not used in the CICADA manuscript and has not been thoroughly tested. However, there is a chance that this may help particularly noisy data. The default is to not </w:t>
       </w:r>
       <w:proofErr w:type="spellStart"/>
       <w:r>
@@ -3829,7 +3864,10 @@
       </w:r>
       <w:proofErr w:type="spellEnd"/>
       <w:r>
-        <w:t xml:space="preserve">, and for CICADA, must at least include the following columns: onset, duration, and </w:t>
+        <w:t>, and for CICADA, must at least include the following columns: onset, durati</w:t>
+      </w:r>
+      <w:r>
+        <w:t xml:space="preserve">on, and </w:t>
       </w:r>
       <w:proofErr w:type="spellStart"/>
       <w:r>
@@ -4688,7 +4726,10 @@
       </w:r>
       <w:proofErr w:type="spellEnd"/>
       <w:r>
-        <w:t xml:space="preserve"> space, then providing the anatomical mask and GM, WM, and CSF probability files are required.</w:t>
+        <w:t xml:space="preserve"> space, then providing the anatomical mask and GM, WM, and C</w:t>
+      </w:r>
+      <w:r>
+        <w:t>SF probability files are required.</w:t>
       </w:r>
     </w:p>
     <w:p/>
@@ -5279,7 +5320,10 @@
       </w:r>
       <w:proofErr w:type="spellEnd"/>
       <w:r>
-        <w:t xml:space="preserve"> unmasked functional file to form the final functional mask. Altogether, this creates a functional mask large enough to include sinus flow and edge artifact, but without retaining large amounts of other material (e.g., skull, eyes, etc.). The unmasked functional file is then masked by this new functional mask (which is used as the functional mask for all future calculations as well). </w:t>
+        <w:t xml:space="preserve"> unmasked</w:t>
+      </w:r>
+      <w:r>
+        <w:t xml:space="preserve"> functional file to form the final functional mask. Altogether, this creates a functional mask large enough to include sinus flow and edge artifact, but without retaining large amounts of other material (e.g., skull, eyes, etc.). The unmasked functional file is then masked by this new functional mask (which is used as the functional mask for all future calculations as well). </w:t>
       </w:r>
     </w:p>
     <w:p/>
@@ -5324,10 +5368,13 @@
       </w:r>
       <w:r>
         <w:lastRenderedPageBreak/>
-        <w:t>percentile. Next, the edge region is calculated. First, the susceptibility mask is subtracted from the functional mask. Second, an eroded and smoothed functional mask is subtracted to give the edge region. Gray matter (GM), white matter (WM), and cerebral spinal fluid (CSF) regions are then calculated. First, their corresponding probability files (which can be provided from the user but will default to the ones from fMRIPrep) are resampled, then the edge and susceptibility probability files are subtracted a</w:t>
-      </w:r>
-      <w:r>
-        <w:t xml:space="preserve">nd then masked by the functional mask. Next, a subependymal region is calculated. In short, first, CSF and WM are masked by an eroded anatomy mask. The GM probability is then subtracted out and then smoothing is applied. The overlap between these modified CSF and WM files are then used to estimate the subependymal region. Next, a </w:t>
+        <w:t>percentile. Next, the edge region is calculated. First, the susceptibility mask is subtracted from the functional mask. Second, an eroded and smoothed functional mask is subtracted to give the edge</w:t>
+      </w:r>
+      <w:r>
+        <w:t xml:space="preserve"> region. Gray matter (GM), white matter (WM), and cerebral spinal fluid (CSF) regions are then calculated. First, their corresponding probability files (which can be provided from the user but will default to the ones from fMRIPrep) are resampled, then the edge and susceptibility probability files are subtracted and then masked by the functional mask. Next, a subependymal region is calculated. In short, first, CSF and WM are masked by an eroded anatomy mask. The GM probability is then subtracted out and the</w:t>
+      </w:r>
+      <w:r>
+        <w:t xml:space="preserve">n smoothing is applied. The overlap between these modified CSF and WM files are then used to estimate the subependymal region. Next, a </w:t>
       </w:r>
       <w:proofErr w:type="spellStart"/>
       <w:r>
@@ -5359,7 +5406,10 @@
       </w:r>
       <w:proofErr w:type="spellEnd"/>
       <w:r>
-        <w:t xml:space="preserve">” region (a region containing mostly outside sinuses and not the inner CSF) is created by subtracting the CSF, subependymal,  edge, susceptibility, and eroded anatomy mask regions from the outbrain region. This concludes the major region/mask generations of the first </w:t>
+        <w:t>” region (a region containing mostly outside sinuses and not t</w:t>
+      </w:r>
+      <w:r>
+        <w:t xml:space="preserve">he inner CSF) is created by subtracting the CSF, subependymal,  edge, susceptibility, and eroded anatomy mask regions from the outbrain region. This concludes the major region/mask generations of the first </w:t>
       </w:r>
       <w:proofErr w:type="spellStart"/>
       <w:r>
@@ -5530,10 +5580,7 @@
         <w:t>” parameter, reflecting how much of the IC spatial-map magnitude is retained following smoothing. In general, spatially coherent ICs retain more of their magnitude following smoothing.</w:t>
       </w:r>
       <w:r>
-        <w:t xml:space="preserve"> </w:t>
-      </w:r>
-      <w:r>
-        <w:t xml:space="preserve">The first </w:t>
+        <w:t xml:space="preserve"> The first </w:t>
       </w:r>
       <w:proofErr w:type="spellStart"/>
       <w:r>
@@ -5740,109 +5787,112 @@
       </w:r>
       <w:proofErr w:type="spellStart"/>
       <w:r>
+        <w:t>basescr</w:t>
+      </w:r>
+      <w:r>
+        <w:t>ipt</w:t>
+      </w:r>
+      <w:proofErr w:type="spellEnd"/>
+      <w:r>
+        <w:t xml:space="preserve"> to calculate the general IC spatial overlap with each relevant region and network. The relative proportion of each region overlap compared to the total spatial IC map is also calculated. </w:t>
+      </w:r>
+      <w:r>
+        <w:t>Smoothness (“</w:t>
+      </w:r>
+      <w:proofErr w:type="spellStart"/>
+      <w:r>
+        <w:t>Smoothing_Retention</w:t>
+      </w:r>
+      <w:proofErr w:type="spellEnd"/>
+      <w:r>
+        <w:t>”) is estimated by dividing the summed magnitude of the smoothed IC z-stat map by the corresponding summed magnitude of the unsmoothed map</w:t>
+      </w:r>
+      <w:r>
+        <w:t xml:space="preserve"> </w:t>
+      </w:r>
+      <w:r>
+        <w:t>(see “</w:t>
+      </w:r>
+      <w:proofErr w:type="spellStart"/>
+      <w:r>
+        <w:t>Basescript</w:t>
+      </w:r>
+      <w:proofErr w:type="spellEnd"/>
+      <w:r>
+        <w:t xml:space="preserve"> 1:</w:t>
+      </w:r>
+      <w:r>
+        <w:t xml:space="preserve"> </w:t>
+      </w:r>
+      <w:r>
+        <w:rPr>
+          <w:rFonts w:ascii="Consolas" w:hAnsi="Consolas" w:cs="Consolas"/>
+        </w:rPr>
+        <w:t>CICADA_1_MasksandICAs.sh</w:t>
+      </w:r>
+      <w:r>
+        <w:t>” section). Next, general power frequency  proportions are calculated and categorized by low frequency (&lt;0.008 Hz), BOLD (0.008-0.15 Hz), and high frequency (&gt;0.15 Hz). The overlap between the IC power frequencies and the estimated HRF responses power frequencies is also calculated (“</w:t>
+      </w:r>
+      <w:proofErr w:type="spellStart"/>
+      <w:r>
+        <w:t>hrf</w:t>
+      </w:r>
+      <w:proofErr w:type="spellEnd"/>
+      <w:r>
+        <w:t xml:space="preserve"> power frequency overlap”). Next, timeseries correlations to DVARS, Framewise Displacement (FD, the version proposed by Power 2012</w:t>
+      </w:r>
+      <w:r>
+        <w:fldChar w:fldCharType="begin"/>
+      </w:r>
+      <w:r>
+        <w:instrText>ADDIN ZOTERO_ITEM CSL_CITATION {"citationID":"jdCAAAkY","properties":{"formattedCitation":"\\super 4\\nosupersub{}","plainCitation":"4","noteIndex":0},"citationItems":[{"id":175,"uris":["http://zotero.org/users/9019901/items/ZJD89E2C"],"itemData":{"id":175,"type":"article-journal","abstract":"Here, we demonstrate that subject motion produces substantial changes in the timecourses of resting state functional connectivity MRI (rs-fcMRI) data despite compensatory spatial registration and regression of motion e</w:instrText>
+      </w:r>
+      <w:r>
+        <w:instrText>stimates from the data. These changes cause systematic but spurious correlation structures throughout the brain. Specifically, many long-distance correlations are decreased by subject motion, whereas many short-distance correlations are increased. These changes in rs-fcMRI correlations do not arise from, nor are they adequately countered by, some common functional connectivity processing steps. Two indices of data quality are proposed, and a simple method to reduce motion-related effects in rs-fcMRI analyse</w:instrText>
+      </w:r>
+      <w:r>
+        <w:instrText>s is demonstrated that should be flexibly implementable across a variety of software platforms. We demonstrate how application of this technique impacts our own data, modifying previous conclusions about brain development. These results suggest the need for greater care in dealing with subject motion, and the need to critically revisit previous rs-fcMRI work that may not have adequately controlled for effects of transient subject movements.","container-title":"NeuroImage","DOI":"10.1016/j.neuroimage.2011.10</w:instrText>
+      </w:r>
+      <w:r>
+        <w:instrText>.018","ISSN":"1053-8119","issue":"3","journalAbbreviation":"NeuroImage","page":"2142-2154","source":"ScienceDirect","title":"Spurious but systematic correlations in functional connectivity MRI networks arise from subject motion","volume":"59","author":[{"family":"Power","given":"Jonathan D."},{"family":"Barnes","given":"Kelly A."},{"family":"Snyder","given":"Abraham Z."},{"family":"Schlaggar","given":"Bradley L."},{"family":"Petersen","given":"Steven E."}],"issued":{"date-parts":[["2012",2,1]]},"citation-ke</w:instrText>
+      </w:r>
+      <w:r>
+        <w:instrText>y":"powerSpuriousSystematicCorrelations2012"}}],"schema":"https://github.com/citation-style-language/schema/raw/master/csl-citation.json"}</w:instrText>
+      </w:r>
+      <w:r>
+        <w:fldChar w:fldCharType="separate"/>
+      </w:r>
+      <w:r>
+        <w:rPr>
+          <w:vertAlign w:val="superscript"/>
+        </w:rPr>
+        <w:t>4</w:t>
+      </w:r>
+      <w:r>
+        <w:fldChar w:fldCharType="end"/>
+      </w:r>
+      <w:r>
+        <w:t xml:space="preserve">), the six motion parameters, white matter, CSF, and global signal, are all calculated. These parameters are pulled from a user-provided confound file but will default to pull from the fMRIPrep confound file if it exists. Specifically, a detrended DVARS and FD are correlated to a detrended, differentiated, and absolute valued timeseries. This method is chosen as DVARS and FD are, by definition, differentiated and absolute valued parameters as well. General IC timeseries “spikiness” is also estimated by the </w:t>
+      </w:r>
+      <w:r>
+        <w:t>maximum absolute value of the normalized timeseries.</w:t>
+      </w:r>
+    </w:p>
+    <w:p/>
+    <w:p>
+      <w:r>
+        <w:t xml:space="preserve">The second </w:t>
+      </w:r>
+      <w:proofErr w:type="spellStart"/>
+      <w:r>
         <w:t>basescript</w:t>
       </w:r>
       <w:proofErr w:type="spellEnd"/>
       <w:r>
-        <w:t xml:space="preserve"> to calculate the general IC spatial overlap with each relevant region and network. The relative proportion of each region overlap compared to the total spatial IC map is also calculated. </w:t>
-      </w:r>
-      <w:r>
-        <w:t>Smoothness (“</w:t>
-      </w:r>
-      <w:proofErr w:type="spellStart"/>
-      <w:r>
-        <w:t>Smoothing_Retention</w:t>
-      </w:r>
-      <w:proofErr w:type="spellEnd"/>
-      <w:r>
-        <w:t>”) is estimated by dividing the summed magnitude of the smoothed IC z-stat map by the corresponding summed magnitude of the unsmoothed map</w:t>
-      </w:r>
-      <w:r>
-        <w:t xml:space="preserve"> </w:t>
-      </w:r>
-      <w:r>
-        <w:t>(see “</w:t>
-      </w:r>
-      <w:proofErr w:type="spellStart"/>
-      <w:r>
-        <w:t>Basescript</w:t>
-      </w:r>
-      <w:proofErr w:type="spellEnd"/>
-      <w:r>
-        <w:t xml:space="preserve"> 1:</w:t>
-      </w:r>
-      <w:r>
-        <w:t xml:space="preserve"> </w:t>
-      </w:r>
-      <w:r>
-        <w:rPr>
-          <w:rFonts w:ascii="Consolas" w:hAnsi="Consolas" w:cs="Consolas"/>
-        </w:rPr>
-        <w:t>CICADA_1_MasksandICAs.sh</w:t>
-      </w:r>
-      <w:r>
-        <w:t>” section). Next, general power frequency  proportions are calculated and categorized by low frequency (&lt;0.008 Hz), BOLD (0.008-0.15 Hz), and high frequency (&gt;0.15 Hz). The overlap between the IC power frequencies and the estimated HRF responses power frequencies is also calculated (“</w:t>
-      </w:r>
-      <w:proofErr w:type="spellStart"/>
-      <w:r>
-        <w:t>hrf</w:t>
-      </w:r>
-      <w:proofErr w:type="spellEnd"/>
-      <w:r>
-        <w:t xml:space="preserve"> power frequency overlap”). Next, timeseries correlations to DVARS, Framewise Displacement (FD, the version proposed by Power 2012</w:t>
-      </w:r>
-      <w:r>
-        <w:fldChar w:fldCharType="begin"/>
-      </w:r>
-      <w:r>
-        <w:instrText>ADDIN ZOTERO_ITEM CSL_CITATION {"citationID":"jdCAAAkY","properties":{"formattedCitation":"\\super 4\\nosupersub{}","plainCitation":"4","noteIndex":0},"citationItems":[{"id":175,"uris":["http://zotero.org/users/9019901/items/ZJD89E2C"],"itemData":{"id":175,"type":"article-journal","abstract":"Here, we demonstrate that subject motion produces substantial changes in the timecourses of resting state functional connectivity MRI (rs-fcMRI) data despite compensatory spatial registration and regression of motion e</w:instrText>
-      </w:r>
-      <w:r>
-        <w:instrText>stimates from the data. These changes cause systematic but spurious correlation structures throughout the brain. Specifically, many long-distance correlations are decreased by subject motion, whereas many short-distance correlations are increased. These changes in rs-fcMRI correlations do not arise from, nor are they adequately countered by, some common functional connectivity processing steps. Two indices of data quality are proposed, and a simple method to reduce motion-related effects in rs-fcMRI analyse</w:instrText>
-      </w:r>
-      <w:r>
-        <w:instrText>s is demonstrated that should be flexibly implementable across a variety of software platforms. We demonstrate how application of this technique impacts our own data, modifying previous conclusions about brain development. These results suggest the need for greater care in dealing with subject motion, and the need to critically revisit previous rs-fcMRI work that may not have adequately controlled for effects of transient subject movements.","container-title":"NeuroImage","DOI":"10.1016/j.neuroimage.2011.10</w:instrText>
-      </w:r>
-      <w:r>
-        <w:instrText>.018","ISSN":"1053-8119","issue":"3","journalAbbreviation":"NeuroImage","page":"2142-2154","source":"ScienceDirect","title":"Spurious but systematic correlations in functional connectivity MRI networks arise from subject motion","volume":"59","author":[{"family":"Power","given":"Jonathan D."},{"family":"Barnes","given":"Kelly A."},{"family":"Snyder","given":"Abraham Z."},{"family":"Schlaggar","given":"Bradley L."},{"family":"Petersen","given":"Steven E."}],"issued":{"date-parts":[["2012",2,1]]},"citation-ke</w:instrText>
-      </w:r>
-      <w:r>
-        <w:instrText>y":"powerSpuriousSystematicCorrelations2012"}}],"schema":"https://github.com/citation-style-language/schema/raw/master/csl-citation.json"}</w:instrText>
-      </w:r>
-      <w:r>
-        <w:fldChar w:fldCharType="separate"/>
-      </w:r>
-      <w:r>
-        <w:rPr>
-          <w:vertAlign w:val="superscript"/>
-        </w:rPr>
-        <w:t>4</w:t>
-      </w:r>
-      <w:r>
-        <w:fldChar w:fldCharType="end"/>
-      </w:r>
-      <w:r>
-        <w:t xml:space="preserve">), the six motion parameters, white matter, CSF, and global signal, are all calculated. These parameters are pulled from a user-provided confound file but will default to pull from the fMRIPrep confound file if it exists. Specifically, a detrended DVARS and FD are correlated to a detrended, differentiated, and absolute valued timeseries. This method is chosen as DVARS and FD are, by definition, differentiated and absolute valued parameters as well. General IC timeseries “spikiness” is also estimated by the </w:t>
-      </w:r>
-      <w:r>
-        <w:t>maximum absolute value of the normalized timeseries.</w:t>
-      </w:r>
-    </w:p>
-    <w:p/>
-    <w:p>
-      <w:r>
-        <w:t xml:space="preserve">The second </w:t>
-      </w:r>
-      <w:proofErr w:type="spellStart"/>
-      <w:r>
-        <w:t>basescript</w:t>
-      </w:r>
-      <w:proofErr w:type="spellEnd"/>
-      <w:r>
-        <w:t xml:space="preserve"> then uses k-means clustering, classified into three groups, to cycle through relevant noise profiles (see manuscript for more detail on noise profiles), brain networks, and other related variables detailed above. The initial k-means starting points are given as the minimum, median, and maximum values (“k-means classified” as low, medium, or high). Thus, the ICs are clustered as either high, medium, or low in that noise profile, network, or other variable. Many of these classifications are labeled as either</w:t>
-      </w:r>
-      <w:r>
-        <w:t xml:space="preserve"> “good” (highly likely to indicate </w:t>
+        <w:t xml:space="preserve"> then uses k-means clustering, classified into three groups, to cycle through relevant noise profiles (see manuscript for more detail on noise profiles), brain networks, and other related variables detailed above. The initial k-means starting points are given as the minimum, median, and maximum values (“k-means classified” as low, medium, or high). Thus, the ICs are clustered as either high, medium, or low in that noise profile, network, or other variable. Many of these classifications are labeled</w:t>
+      </w:r>
+      <w:r>
+        <w:t xml:space="preserve"> as either “good” (highly likely to indicate </w:t>
       </w:r>
       <w:r>
         <w:lastRenderedPageBreak/>
@@ -6009,13 +6059,7 @@
         <w:rPr>
           <w:rFonts w:eastAsiaTheme="minorEastAsia"/>
         </w:rPr>
-        <w:t xml:space="preserve"> overlap is likely more specific of neural signal than either smoothness or power spectrum overlap. This can be inferred, for example, by </w:t>
-      </w:r>
-      <w:r>
-        <w:rPr>
-          <w:rFonts w:eastAsiaTheme="minorEastAsia"/>
-        </w:rPr>
-        <w:t>the fact that certain noise profiles (e.g., subependymal) can be highly smooth and have great power spectrum overlap but not have high GM overlap.</w:t>
+        <w:t xml:space="preserve"> overlap is likely more specific of neural signal than either smoothness or power spectrum overlap. This can be inferred, for example, by the fact that certain noise profiles (e.g., subependymal) can be highly smooth and have great power spectrum overlap but not have high GM overlap.</w:t>
       </w:r>
     </w:p>
     <w:p>
@@ -6161,7 +6205,10 @@
       </w:r>
       <w:proofErr w:type="spellEnd"/>
       <w:r>
-        <w:t>” column contains CICADA’s final decisions on IC classifications where a 1 is signal, and a 0 is noise.</w:t>
+        <w:t>” column contains CICADA’s final decisi</w:t>
+      </w:r>
+      <w:r>
+        <w:t>ons on IC classifications where a 1 is signal, and a 0 is noise.</w:t>
       </w:r>
     </w:p>
     <w:p/>
@@ -6294,10 +6341,10 @@
       </w:r>
       <w:proofErr w:type="spellEnd"/>
       <w:r>
-        <w:t xml:space="preserve"> two performs a few last actions to make it easier for a user to examine the classification and output. CICADA creates structures to hold all relevant calculations, values, and classifications. CICADA also creates a “compare cleaning” table to compare the relative feature proportions of all ICs to just the ICs that CICADA labeled as signal. CICADA also generates a signal-to-noise ratio image and generates images containing all noise and all signal IC overlaps. Files to perform nonaggressive denoising (the s</w:t>
-      </w:r>
-      <w:r>
-        <w:t xml:space="preserve">tandard default method) and aggressive denoising are saved and exported. Then, </w:t>
+        <w:t xml:space="preserve"> two performs a few last actions to make it easier for a user to examine the classification and output. CICADA creates structures to hold all relevant calculations, values, and classifications. CICADA also creates a “compare cleaning” table to compare the relative feature proportions of all ICs to just the ICs that CICADA labeled as signal. CICADA also generates a signal-to-noise ratio image and generates images containing all noise and all signal IC overlaps. Files to perform nonaggressive denois</w:t>
+      </w:r>
+      <w:r>
+        <w:t xml:space="preserve">ing (the standard default method) and aggressive denoising are saved and exported. Then, </w:t>
       </w:r>
       <w:proofErr w:type="spellStart"/>
       <w:r>
@@ -6353,7 +6400,10 @@
       </w:r>
       <w:proofErr w:type="spellEnd"/>
       <w:r>
-        <w:t xml:space="preserve"> evidence masks; 6-mm-smoothed extended signal-evidence derivatives; the constrained calculation domain; and provenance tables. The continuous signal IC-overlap map is the primary signal-support product. It describes the spatial evidence supplied by ICs labeled as signal, but it is not a calibrated probability of neuronal signal or a definitive tissue mask. These products are additive and do not alter IC labels or the denoised functional output.</w:t>
+        <w:t xml:space="preserve"> evidence masks; 6-mm-smoothed extended signal-evidence derivatives; the constrained calculation domain; and provenance tables. The continuous signal IC-overlap map is the primary signal-support product. It describes the spatial evidence supplied by ICs la</w:t>
+      </w:r>
+      <w:r>
+        <w:t>beled as signal, but it is not a calibrated probability of neuronal signal or a definitive tissue mask. These products are additive and do not alter IC labels or the denoised functional output.</w:t>
       </w:r>
     </w:p>
     <w:p/>
@@ -6394,10 +6444,7 @@
         <w:t xml:space="preserve">matter correlation distribution, and a plot of </w:t>
       </w:r>
       <w:r>
-        <w:t xml:space="preserve">the detrended mean gray matter signal. More </w:t>
-      </w:r>
-      <w:r>
-        <w:t>information on interpreting the QC plots and metrics is provided in the following section “Interpreting QC Plots and Metrics.”</w:t>
+        <w:t>the detrended mean gray matter signal. More information on interpreting the QC plots and metrics is provided in the following section “Interpreting QC Plots and Metrics.”</w:t>
       </w:r>
     </w:p>
     <w:p/>
@@ -6435,7 +6482,10 @@
       </w:r>
       <w:proofErr w:type="spellEnd"/>
       <w:r>
-        <w:t xml:space="preserve"> 3 then calculates the relative noise profile correlations (e.g., correlations within the edge region, correlations within CSF, correlations between GM and framewise displacement, etc. ). Finally, </w:t>
+        <w:t xml:space="preserve"> 3 then calculates the relative noise prof</w:t>
+      </w:r>
+      <w:r>
+        <w:t xml:space="preserve">ile correlations (e.g., correlations within the edge region, correlations within CSF, correlations between GM and framewise displacement, etc. ). Finally, </w:t>
       </w:r>
       <w:proofErr w:type="spellStart"/>
       <w:r>
@@ -6480,7 +6530,10 @@
         <w:t>a better denoised noise profile is a narrower correlation distribution more closely centered to zero</w:t>
       </w:r>
       <w:r>
-        <w:t xml:space="preserve"> (which would thereby result in a lower mean magnitude). As signal ICs are generally spatially smooth, regions that share closer proximity to gray matter (i.e., CSF) may maintain a degree of voxel-wise correlations. </w:t>
+        <w:t xml:space="preserve"> (which would thereby result in a lower mean magnitude). As signal ICs are generally spatially smooth, regions that share closer p</w:t>
+      </w:r>
+      <w:r>
+        <w:t xml:space="preserve">roximity to gray matter (i.e., CSF) may maintain a degree of voxel-wise correlations. </w:t>
       </w:r>
       <w:r>
         <w:rPr>
@@ -6507,7 +6560,10 @@
       </w:r>
       <w:proofErr w:type="spellStart"/>
       <w:r>
-        <w:t>NotGM</w:t>
+        <w:t>N</w:t>
+      </w:r>
+      <w:r>
+        <w:t>otGM</w:t>
       </w:r>
       <w:proofErr w:type="spellEnd"/>
       <w:r>
@@ -6685,7 +6741,14 @@
                 <w:sz w:val="18"/>
                 <w:szCs w:val="18"/>
               </w:rPr>
-              <w:t xml:space="preserve"> CSF, which is not uncommon due to the proximity of CSF voxels to gray matter). The GM correlation distribution is slightly more right skewed than the </w:t>
+              <w:t xml:space="preserve"> CSF, which is not uncommon due to the proximity of CSF </w:t>
+            </w:r>
+            <w:r>
+              <w:rPr>
+                <w:sz w:val="18"/>
+                <w:szCs w:val="18"/>
+              </w:rPr>
+              <w:t xml:space="preserve">voxels to gray matter). The GM correlation distribution is slightly more right skewed than the </w:t>
             </w:r>
             <w:proofErr w:type="spellStart"/>
             <w:r>
@@ -6725,10 +6788,10 @@
       </w:r>
       <w:proofErr w:type="spellEnd"/>
       <w:r>
-        <w:t>. These files can also be found in the qc folder for the given subject. These images similarly compare CICADA denoised (“cleaned”), 8-parameter denoising (“compare”; regress 6 motion parameters, CSF, and WM), and the original data (“orig</w:t>
-      </w:r>
-      <w:r>
-        <w:t xml:space="preserve">”) without any denoising. In short, these images visualize identifiability of the major resting-state networks (by default: default mode, sensorimotor, visual, salience, dorsal attention, executive control, and limbic/reward). Identifiability is measured by extracting a representative time series from the </w:t>
+        <w:t>. These files can also be found in the qc folder for the given subject. These images similarly compare CICADA denoised (“cleaned”), 8-parameter denoising (“compare”; regress 6 motion parameters, CSF, and WM), and the original data (“orig”) without any denoising. In short, these images visualize identifiability of the major resting-state networks (by default: default mode, sensorimotor, visual, salience, dorsal attention, executive control, and limbic/rewa</w:t>
+      </w:r>
+      <w:r>
+        <w:t xml:space="preserve">rd). Identifiability is measured by extracting a representative time series from the </w:t>
       </w:r>
       <w:proofErr w:type="spellStart"/>
       <w:r>
@@ -6736,10 +6799,10 @@
       </w:r>
       <w:proofErr w:type="spellEnd"/>
       <w:r>
-        <w:t xml:space="preserve"> seed regions for each network and correlating that seed time series with the time series of each voxel in the functional mask (cleaned, compare, orig</w:t>
-      </w:r>
-      <w:r>
-        <w:t xml:space="preserve">). Voxels are then assigned a network label (e.g., 1–7 by default) corresponding to the network with the highest correlation. Voxels whose highest network correlation have a p-value &gt; 0.5 (i.e., z-score &lt; 0.67 after Fisher z-transform) are not assigned a network label. The network identifiability </w:t>
+        <w:t xml:space="preserve"> seed regions for each network and correlating that seed time series with the time series of each voxel in the functional mask (cleaned, compare, orig). Voxels are then assigned a network label (e.g., 1–7 by default) corresponding to the network with the highest correlation. Voxels whose highest network correlation have a p-value &gt; 0.5 (i.e., z-score &lt; 0.67 after Fisher z-transform) are not assigned a network lab</w:t>
+      </w:r>
+      <w:r>
+        <w:t xml:space="preserve">el. The network identifiability </w:t>
       </w:r>
       <w:proofErr w:type="spellStart"/>
       <w:r>
@@ -6765,16 +6828,16 @@
       </w:r>
       <w:r>
         <w:lastRenderedPageBreak/>
-        <w:t>identifiability images and can be used to compare denoising approaches more directly. In brief, these metrics quantify how often voxels show high-confidence assignment to a single network, defined by both sufficient absolute correlation strength with the best-matching network and clear separation from the second-best network, rather than ambiguous connectivity across multiple networks. Values are computed within gray matter voxels that also fall within the functional mask and are reported as fractions betwe</w:t>
-      </w:r>
-      <w:r>
-        <w:t>en 0 and 1, with higher values indicating stronger and more distinct network assignments. Altogether, the table includes per-network metrics computed within each network’s seed regions (reflecting how cleanly each network’s core regions are identified), whole–gray-matter metrics computed across all gray-matter voxels (reflecting overall network separability), and difference values comparing CICADA-denoised data to the comparison and original data (with positive values indicating improved network identifiabi</w:t>
-      </w:r>
-      <w:r>
-        <w:t xml:space="preserve">lity with CICADA). Among these metrics, the “overall score” values for gray matter and for each network are intended to be the most informative summary measures, whereas the threshold- and separation-based component metrics provide additional context regarding the sources of these differences. Notably, quantitative assessment of network identifiability is inherently challenging due to several factors, including that large-scale brain networks are not strictly independent. As such, visual inspection remains </w:t>
-      </w:r>
-      <w:r>
-        <w:t xml:space="preserve">the primary means for assessing network identifiability (with MELODIC component outputs recommended as the most informative visual representation, and the “network identifiability” </w:t>
+        <w:t>identifiability images and can be used to compare denoising approaches more directly. In brief, these metrics quantify how often voxels show high-confidence assignment to a single network, defined by both sufficient absolute correlation strength with the best-matching network and c</w:t>
+      </w:r>
+      <w:r>
+        <w:t>lear separation from the second-best network, rather than ambiguous connectivity across multiple networks. Values are computed within gray matter voxels that also fall within the functional mask and are reported as fractions between 0 and 1, with higher values indicating stronger and more distinct network assignments. Altogether, the table includes per-network metrics computed within each network’s seed regions (reflecting how cleanly each network’s core regions are identified), whole–gray-matter metrics co</w:t>
+      </w:r>
+      <w:r>
+        <w:t xml:space="preserve">mputed across all gray-matter voxels (reflecting overall network separability), and difference values comparing CICADA-denoised data to the comparison and original data (with positive values indicating improved network identifiability with CICADA). Among these metrics, the “overall score” values for gray matter and for each network are intended to be the most informative summary measures, whereas the threshold- and separation-based component metrics provide additional context regarding the sources of these </w:t>
+      </w:r>
+      <w:r>
+        <w:t xml:space="preserve">differences. Notably, quantitative assessment of network identifiability is inherently challenging due to several factors, including that large-scale brain networks are not strictly independent. As such, visual inspection remains the primary means for assessing network identifiability (with MELODIC component outputs recommended as the most informative visual representation, and the “network identifiability” </w:t>
       </w:r>
       <w:proofErr w:type="spellStart"/>
       <w:r>
@@ -6782,7 +6845,10 @@
       </w:r>
       <w:proofErr w:type="spellEnd"/>
       <w:r>
-        <w:t xml:space="preserve"> serving as a complementary secondary visualization), with the quantitative results of the network_identifiability_results.csv serving as possible further supportive context.</w:t>
+        <w:t xml:space="preserve"> serving as a complementary secondary visualization), with the quantitative results of the netw</w:t>
+      </w:r>
+      <w:r>
+        <w:t>ork_identifiability_results.csv serving as possible further supportive context.</w:t>
       </w:r>
     </w:p>
     <w:p/>
@@ -7846,7 +7912,10 @@
       </w:r>
       <w:proofErr w:type="spellEnd"/>
       <w:r>
-        <w:t>. The general flow of the Manual CICADA Pipeline can be seen in the figure below.</w:t>
+        <w:t>. The general flow of the Manual CICADA Pipeline can be seen in the fi</w:t>
+      </w:r>
+      <w:r>
+        <w:t>gure below.</w:t>
       </w:r>
     </w:p>
     <w:p/>
@@ -8468,7 +8537,10 @@
       </w:r>
       <w:proofErr w:type="spellStart"/>
       <w:r>
-        <w:t>output_dirname</w:t>
+        <w:t>outp</w:t>
+      </w:r>
+      <w:r>
+        <w:t>ut_dirname</w:t>
       </w:r>
       <w:proofErr w:type="spellEnd"/>
       <w:r>
@@ -8527,7 +8599,10 @@
       </w:r>
       <w:proofErr w:type="spellEnd"/>
       <w:r>
-        <w:t xml:space="preserve">” is the gaussian smoothing kernel FWHM size in mm (default smoothing size is 1.5x the voxel size and can be automatically applied with </w:t>
+        <w:t>” is the gaussian smoothing kernel FWHM size in mm (default smoothing size is 1.5x the voxel size and can be aut</w:t>
+      </w:r>
+      <w:r>
+        <w:t xml:space="preserve">omatically applied with </w:t>
       </w:r>
       <w:proofErr w:type="spellStart"/>
       <w:r>
@@ -8625,7 +8700,13 @@
         <w:rPr>
           <w:u w:val="single"/>
         </w:rPr>
-        <w:t>Important to note, QC plotting following Group CICADA is easiest to interpret with minimal/no smoothing and no bandpass filtering.</w:t>
+        <w:t>Important to note, QC plotting following Group CICADA is easiest to interpret with minimal/no smoothing and no bandpass f</w:t>
+      </w:r>
+      <w:r>
+        <w:rPr>
+          <w:u w:val="single"/>
+        </w:rPr>
+        <w:t>iltering.</w:t>
       </w:r>
       <w:r>
         <w:t xml:space="preserve"> Smoothing, and likely bandpass filtering, will create new within-noise-profile-region correlations in the QC plots. Even without smoothing or bandpass </w:t>
@@ -8675,7 +8756,10 @@
         <w:t xml:space="preserve"> = [];</w:t>
       </w:r>
       <w:r>
-        <w:t>) is recommended. Otherwise, minimal smoothing (from the default value and up to 6 mm), as well as no (</w:t>
+        <w:t>) is recommended. Otherwise, minimal sm</w:t>
+      </w:r>
+      <w:r>
+        <w:t>oothing (from the default value and up to 6 mm), as well as no (</w:t>
       </w:r>
       <w:proofErr w:type="spellStart"/>
       <w:r>
@@ -8723,7 +8807,13 @@
         <w:rPr>
           <w:u w:val="single"/>
         </w:rPr>
-        <w:t>Altogether then, a user should carefully consider these four parameters, but for reference, the creator of CICADA typically prefers the following:</w:t>
+        <w:t>Altogether then, a user should c</w:t>
+      </w:r>
+      <w:r>
+        <w:rPr>
+          <w:u w:val="single"/>
+        </w:rPr>
+        <w:t>arefully consider these four parameters, but for reference, the creator of CICADA typically prefers the following:</w:t>
       </w:r>
       <w:r>
         <w:t xml:space="preserve"> 2</w:t>
@@ -8735,7 +8825,10 @@
         <w:t>nd</w:t>
       </w:r>
       <w:r>
-        <w:t xml:space="preserve"> polynomial detrending (remove potential remaining major drifts), bandpass filtering of [0.008, 0.15] (conservative minimization of unwanted frequencies, assuming this does not impact task design frequencies – if bandpass filtering is implemented, detrending should not be necessary), a smoothing kernel of 3 mm (minimal, but evident, smoothing, so to still be mostly applicable to both ROI and voxel-wise analyses), and no voxel-wise scaling.</w:t>
+        <w:t xml:space="preserve"> polynomial detrending (remove potential remaining major drifts), bandpass filtering of [0.008, 0.15] (conservative minimization of unwanted frequencies, assuming this does not impact task design frequencies – if bandpass filtering is implemented, detrending should not be necessary), a smoothing kernel of 3 mm (minimal, but evident, smoothing, so to still be mostly applicable to both ROI and</w:t>
+      </w:r>
+      <w:r>
+        <w:t xml:space="preserve"> voxel-wise analyses), and no voxel-wise scaling.</w:t>
       </w:r>
     </w:p>
     <w:p/>
@@ -8787,7 +8880,13 @@
         <w:rPr>
           <w:rFonts w:ascii="Consolas" w:hAnsi="Consolas" w:cs="Consolas"/>
         </w:rPr>
-        <w:t xml:space="preserve"> = {‘102’, ‘103’, ‘108’};</w:t>
+        <w:t xml:space="preserve"> = {‘102’, ‘10</w:t>
+      </w:r>
+      <w:r>
+        <w:rPr>
+          <w:rFonts w:ascii="Consolas" w:hAnsi="Consolas" w:cs="Consolas"/>
+        </w:rPr>
+        <w:t>3’, ‘108’};</w:t>
       </w:r>
       <w:r>
         <w:t xml:space="preserve"> and </w:t>
@@ -8887,7 +8986,13 @@
         <w:rPr>
           <w:rFonts w:ascii="Consolas" w:hAnsi="Consolas" w:cs="Consolas"/>
         </w:rPr>
-        <w:t>subject_level_data_table.subject</w:t>
+        <w:t>subj</w:t>
+      </w:r>
+      <w:r>
+        <w:rPr>
+          <w:rFonts w:ascii="Consolas" w:hAnsi="Consolas" w:cs="Consolas"/>
+        </w:rPr>
+        <w:t>ect_level_data_table.subject</w:t>
       </w:r>
       <w:proofErr w:type="spellEnd"/>
       <w:r>
@@ -8946,7 +9051,13 @@
         <w:rPr>
           <w:u w:val="single"/>
         </w:rPr>
-        <w:t xml:space="preserve">The simplest method to accomplish incorporating subject-level data is likely to create your own .csv table of subject-level data and then just use the </w:t>
+        <w:t>The simplest method to accomplish incorporating subject-level data is likely to create your o</w:t>
+      </w:r>
+      <w:r>
+        <w:rPr>
+          <w:u w:val="single"/>
+        </w:rPr>
+        <w:t xml:space="preserve">wn .csv table of subject-level data and then just use the </w:t>
       </w:r>
       <w:proofErr w:type="spellStart"/>
       <w:r>
@@ -8968,21 +9079,7 @@
         <w:rPr>
           <w:u w:val="single"/>
         </w:rPr>
-        <w:t xml:space="preserve"> function in </w:t>
-      </w:r>
-      <w:proofErr w:type="spellStart"/>
-      <w:r>
-        <w:rPr>
-          <w:u w:val="single"/>
-        </w:rPr>
-        <w:t>Matlab</w:t>
-      </w:r>
-      <w:proofErr w:type="spellEnd"/>
-      <w:r>
-        <w:rPr>
-          <w:u w:val="single"/>
-        </w:rPr>
-        <w:t xml:space="preserve"> to import the table. From there you can then feed that as the </w:t>
+        <w:t xml:space="preserve"> function in Matlab to import the table. From there you can then feed that as the </w:t>
       </w:r>
       <w:proofErr w:type="spellStart"/>
       <w:r>
@@ -9106,10 +9203,10 @@
       </w:r>
       <w:proofErr w:type="spellEnd"/>
       <w:r>
-        <w:t xml:space="preserve"> IC probability files (automatically generated by MELODIC) to identify the group ICs most likely to be a part of each of the 7-networks (visual, sensorimotor, dorsal attention, salience, executive control, default, subcortical). These networks specifically are chosen because they tend to align well with MELODIC ICs (e.g., subcortical regions tend to be identified by themselves). Group CICADA will list the kept ICs and what networks they belong to (kept_ICs.csv and Network_ICs.csv), and generates, for each n</w:t>
-      </w:r>
-      <w:r>
-        <w:t>etwork, an overall mask (IC_mask_networks.nii.gz), the highest probabilities for each voxel (</w:t>
+        <w:t xml:space="preserve"> IC probability files (automatically generated by MELODIC) to identify the group ICs most likely to be a part of each of the 7-networks (visual, sensorimotor, dorsal attention, salience, executive control, default, subcortical). These networks specifically are chosen because they tend to align well with MELODIC ICs (e.g., subcortical regions tend to be identified by themselves). Group CICADA will list the kept ICs and what networks they belong to (kept_ICs.csv and Network_ICs.csv), and gene</w:t>
+      </w:r>
+      <w:r>
+        <w:t>rates, for each network, an overall mask (IC_mask_networks.nii.gz), the highest probabilities for each voxel (</w:t>
       </w:r>
       <w:proofErr w:type="spellStart"/>
       <w:r>
@@ -9179,10 +9276,10 @@
         <w:t>Excludes</w:t>
       </w:r>
       <w:r>
-        <w:t>” is for data that the user does not want included in the Group QC analysis. This might apply, for example, to data where there was a scanner error, and the resulting image was found to be unusable. In the example from the previous paragraph, for example, perhaps MRIQC software identified sub-108 session 02 to be an extreme outlier in data quality from all other data (e.g., because of a scanner error). Alternatively, perhaps it only 10 total ICs were generated, or no signal ICs were identified making it unu</w:t>
-      </w:r>
-      <w:r>
-        <w:t xml:space="preserve">sable… Then we would set the excludes variable to </w:t>
+        <w:t>” is for data that the user does not want included in the Group QC analysis. This might apply, for example, to data where there was a scanner error, and the resulting image was found to be unusable. In the example from the previous paragraph, for example, perhaps MRIQC software identified sub-108 session 02 to be an extreme outlier in data quality from all other data (e.g., because of a scanner error). Alternatively, perhaps it only 10 total ICs were generated, or no signal ICs were identified makin</w:t>
+      </w:r>
+      <w:r>
+        <w:t xml:space="preserve">g it unusable… Then we would set the excludes variable to </w:t>
       </w:r>
       <w:r>
         <w:rPr>
@@ -9217,15 +9314,10 @@
       </w:r>
       <w:proofErr w:type="spellEnd"/>
       <w:r>
-        <w:t xml:space="preserve">”. This ensures that Group CICADA correctly pulls the manually adjusted data for that image. For example, let’s say in our example that for sub-102 session 02, the QC plots show poor results but are greatly improved upon performing Manual CICADA. Then, a user could consider including the </w:t>
-      </w:r>
-      <w:proofErr w:type="gramStart"/>
-      <w:r>
-        <w:t>manually-adjusted</w:t>
-      </w:r>
-      <w:proofErr w:type="gramEnd"/>
-      <w:r>
-        <w:t xml:space="preserve"> data in the Group CICADA </w:t>
+        <w:t>”. This ensures that Group CICADA cor</w:t>
+      </w:r>
+      <w:r>
+        <w:t xml:space="preserve">rectly pulls the manually adjusted data for that image. For example, let’s say in our example that for sub-102 session 02, the QC plots show poor results but are greatly improved upon performing Manual CICADA. Then, a user could consider including the manually-adjusted data in the Group CICADA </w:t>
       </w:r>
       <w:proofErr w:type="gramStart"/>
       <w:r>
@@ -9350,7 +9442,10 @@
       </w:r>
       <w:proofErr w:type="spellEnd"/>
       <w:r>
-        <w:t xml:space="preserve"> copies over and combines all the individual data together into a single folder. For each image, the function uses user-defined inputs to determine if the current image should be entirely excluded or if Manual CICADA data (if it exists) should be used instead of Automatic CICADA. </w:t>
+        <w:t xml:space="preserve"> copies over and combines all the individual data together into a single folder. For each image, the function uses user-defined inputs to determine if the current image should be enti</w:t>
+      </w:r>
+      <w:r>
+        <w:t xml:space="preserve">rely excluded or if Manual CICADA data (if it exists) should be used instead of Automatic CICADA. </w:t>
       </w:r>
       <w:proofErr w:type="spellStart"/>
       <w:r>
@@ -9406,10 +9501,13 @@
       </w:r>
       <w:proofErr w:type="spellEnd"/>
       <w:r>
-        <w:t xml:space="preserve"> and README.txt. The manifest is the authoritative volume-to-image mapping and records zero-based and one-based volume indices, subject, session, task, CICADA mode, release metadata, task directory, and exact source paths. The support-products directory is staged, checked for the expected number of volumes, and replaced as a unit to avoid partial output. The legacy group_signal_funcmask.nii.gz and other legacy group outputs remain unchanged; v1.1.0 does not redefine the legacy group signal mask from the new</w:t>
-      </w:r>
-      <w:r>
-        <w:t xml:space="preserve"> evidence maps.</w:t>
+        <w:t xml:space="preserve"> and README.t</w:t>
+      </w:r>
+      <w:r>
+        <w:t>xt. The manifest is the authoritative volume-to-image mapping and records zero-based and one-based volume indices, subject, session, task, CICADA mode, release metadata, task directory, and exact source paths. The support-products directory is staged, checked for the expected number of volumes, and replaced as a unit to avoid partial output. The legacy group_signal_funcmask.nii.gz and other legacy group outputs remain unchanged; v1.1.0 does not redefine the legacy group signal mask from the new evidence map</w:t>
+      </w:r>
+      <w:r>
+        <w:t>s.</w:t>
       </w:r>
     </w:p>
     <w:p/>
@@ -9440,7 +9538,10 @@
       </w:r>
       <w:proofErr w:type="spellEnd"/>
       <w:r>
-        <w:t>” (area outside of GM) temporal variance, a signal and noise IC spatial overlap image, what proportion of gray matter is covered by signal ICs, what proportion of signal ICs is found within the gray matter, a dice coefficient of gray matter and signal IC overlap, and the number and percent of ICs labeled as signal. All relevant QC calculations are then combined into relevant tables.</w:t>
+        <w:t>” (area outside of GM) temporal variance, a signal and noise IC spatial overlap image, what proportion of gray matter is covered by signal ICs, what proportion of signal ICs is found within the gray matter, a dice coefficient of g</w:t>
+      </w:r>
+      <w:r>
+        <w:t>ray matter and signal IC overlap, and the number and percent of ICs labeled as signal. All relevant QC calculations are then combined into relevant tables.</w:t>
       </w:r>
     </w:p>
     <w:p/>
@@ -9641,7 +9742,10 @@
         <w:t>CICADA_3_QC.m</w:t>
       </w:r>
       <w:r>
-        <w:t xml:space="preserve"> but for the whole group instead of per image). Finally, group MELODIC is run to generate group-level ICs. The resulting ICs that best match each of the seven networks (Medial Visual, Sensory Motor, Dorsal Attention, Ventral Attention, </w:t>
+        <w:t xml:space="preserve"> but for the whole group instead of per image). Finally, group MELODIC is run to generate group-level ICs. The resulting ICs that best match each of the seven networks (Medial Visual, Sensory Motor, Dors</w:t>
+      </w:r>
+      <w:r>
+        <w:t xml:space="preserve">al Attention, Ventral Attention, </w:t>
       </w:r>
       <w:proofErr w:type="spellStart"/>
       <w:r>
@@ -9649,10 +9753,10 @@
       </w:r>
       <w:proofErr w:type="spellEnd"/>
       <w:r>
-        <w:t>, Default Mode, Subcortical) from the brain network image are also returned. This is determined, in short, by sorting each IC by their dice coefficient to each network, and then testing, in order, if including the IC overall increases the resulting total dice coefficient. Altogether, this could help a user better evaluate the success of the denoising in capturing different common brain networks. Relatedly, the kept ICs and what networks they belong to are recorded (kept_ICs.csv and Network_ICs.csv), as well</w:t>
-      </w:r>
-      <w:r>
-        <w:t xml:space="preserve"> as, for each network, an overall mask (IC_mask_networks.nii.gz), the highest probabilities for each voxel (</w:t>
+        <w:t>, Default Mode, Subcortical) from the brain network image are also returned. This is determined, in short, by sorting each IC by their dice coefficient to each network, and then testing, in order, if including the IC overall increases the resulting total dice coefficient. Altogether, this could help a user better evaluate the success of the denoising in capturing different common brain networks. Relatedly, the kept ICs and what networks they belong to are recor</w:t>
+      </w:r>
+      <w:r>
+        <w:t>ded (kept_ICs.csv and Network_ICs.csv), as well as, for each network, an overall mask (IC_mask_networks.nii.gz), the highest probabilities for each voxel (</w:t>
       </w:r>
       <w:proofErr w:type="spellStart"/>
       <w:r>
@@ -9739,7 +9843,10 @@
         <w:t>_...plots.jpg”).</w:t>
       </w:r>
       <w:r>
-        <w:t xml:space="preserve"> Thus, the group-level QC plots can be interpreted in much the same manner as the subject-level QC plots (see Evaluating Subject-Level Quality Control &amp; Metrics section). Group CICADA also aggregates all subject level QC plots in a single folder for ease of examination. Of note, </w:t>
+        <w:t xml:space="preserve"> Thus, the group-level QC plots can be interpreted in much the same manner as the subject-level QC plots (see Evaluating Subject-Level Quality Control &amp; Metrics section). Group CICADA also aggregates all subject level QC plots in a single folder for ease of examinati</w:t>
+      </w:r>
+      <w:r>
+        <w:t xml:space="preserve">on. Of note, </w:t>
       </w:r>
       <w:r>
         <w:rPr>
@@ -9757,7 +9864,10 @@
         <w:t>Group QC also creates a “Group QC Table” (i.e., group_qc_table.csv).</w:t>
       </w:r>
       <w:r>
-        <w:t xml:space="preserve"> This provides quality control information on all data in one convenient table. This includes, but is not limited to, the image paths and names, and common outlier flagging (e.g., standard conservative, liberal, and CICADA’s outlier flagging methods). </w:t>
+        <w:t xml:space="preserve"> This provides quality control information on all data in one convenient table. This includes, but i</w:t>
+      </w:r>
+      <w:r>
+        <w:t xml:space="preserve">s not limited to, the image paths and names, and common outlier flagging (e.g., standard conservative, liberal, and CICADA’s outlier flagging methods). </w:t>
       </w:r>
       <w:r>
         <w:rPr>
@@ -9770,7 +9880,10 @@
       </w:r>
       <w:r>
         <w:lastRenderedPageBreak/>
-        <w:t xml:space="preserve">below). Therefore, this table allows a user to easily calculate the noise profile summary metric data, like that shown in Table 2. </w:t>
+        <w:t>below). Therefore, this table allows a user to easily calculate the noise profile summary metric data, like that shown i</w:t>
+      </w:r>
+      <w:r>
+        <w:t xml:space="preserve">n Table 2. </w:t>
       </w:r>
       <w:r>
         <w:rPr>
@@ -9860,7 +9973,10 @@
       </w:r>
       <w:proofErr w:type="spellEnd"/>
       <w:r>
-        <w:t>/qc are intended for QC and sensitivity analyses; they are not ground-truth neural tissue masks. A downstream method may use the continuous stacks to define and validate an analysis-specific eligibility domain.</w:t>
+        <w:t>/qc are intended for QC and sensitivity analyses; they are not ground-truth neural tissue masks. A downstream method may use the continuous stacks to define and validate an analysis-specific</w:t>
+      </w:r>
+      <w:r>
+        <w:t xml:space="preserve"> eligibility domain.</w:t>
       </w:r>
     </w:p>
     <w:p/>
@@ -10233,7 +10349,14 @@
                 <w:sz w:val="18"/>
                 <w:szCs w:val="18"/>
               </w:rPr>
-              <w:t xml:space="preserve"> A truncated version of a CICADA-generated Group QC Correlation Distribution Table is shown here for reference. This table gives the data necessary for a user to calculate the noise profile summary metrics as given in the CICADA manuscript and detailed more in Table 2. In short, a user just needs to take the mean of the magnitude off each column to calculate the associated noise profile metric. To calculate the Denoising Success parameter, a user would need to also calculate the </w:t>
+              <w:t xml:space="preserve"> A truncated version of a CICADA-generated Group QC Correlation Distribution Table is shown here for reference. This table gives the data necessary for a user to calculate the noise profile summary metrics as given in the CICADA manuscript and detailed more in Table 2. In short, a user just needs to take the mean of the magnitude off each column to calculate the associated noise profile metric. To calculate the Denoising Success parameter, a user would need to also c</w:t>
+            </w:r>
+            <w:r>
+              <w:rPr>
+                <w:sz w:val="18"/>
+                <w:szCs w:val="18"/>
+              </w:rPr>
+              <w:t xml:space="preserve">alculate the </w:t>
             </w:r>
             <w:proofErr w:type="spellStart"/>
             <w:r>
@@ -13052,8 +13175,6 @@
       </w:r>
       <w:r>
         <w:tab/>
-      </w:r>
-      <w:r>
         <w:t xml:space="preserve">Guzmán-Vélez, E. </w:t>
       </w:r>
       <w:r>
@@ -13138,8 +13259,6 @@
       </w:r>
       <w:r>
         <w:tab/>
-      </w:r>
-      <w:r>
         <w:t xml:space="preserve">Power, J. D., Barnes, K. A., Snyder, A. Z., Schlaggar, B. L. &amp; Petersen, S. E. Spurious but systematic correlations in functional connectivity MRI networks arise from subject motion. </w:t>
       </w:r>
       <w:r>
@@ -13265,7 +13384,7 @@
 </file>
 
 <file path=word/numbering.xml><?xml version="1.0" encoding="utf-8"?>
-<w:numbering xmlns:wpc="http://schemas.microsoft.com/office/word/2010/wordprocessingCanvas" xmlns:cx="http://schemas.microsoft.com/office/drawing/2014/chartex" xmlns:cx1="http://schemas.microsoft.com/office/drawing/2015/9/8/chartex" xmlns:cx2="http://schemas.microsoft.com/office/drawing/2015/10/21/chartex" xmlns:cx3="http://schemas.microsoft.com/office/drawing/2016/5/9/chartex" xmlns:cx4="http://schemas.microsoft.com/office/drawing/2016/5/10/chartex" xmlns:cx5="http://schemas.microsoft.com/office/drawing/2016/5/11/chartex" xmlns:cx6="http://schemas.microsoft.com/office/drawing/2016/5/12/chartex" xmlns:cx7="http://schemas.microsoft.com/office/drawing/2016/5/13/chartex" xmlns:cx8="http://schemas.microsoft.com/office/drawing/2016/5/14/chartex" xmlns:mc="http://schemas.openxmlformats.org/markup-compatibility/2006" xmlns:m="http://schemas.openxmlformats.org/officeDocument/2006/math" xmlns:aink="http://schemas.microsoft.com/office/drawing/2016/ink" xmlns:am3d="http://schemas.microsoft.com/office/drawing/2017/model3d" xmlns:oel="http://schemas.microsoft.com/office/2019/extlst" xmlns:r="http://schemas.openxmlformats.org/officeDocument/2006/relationships" xmlns:wp14="http://schemas.microsoft.com/office/word/2010/wordprocessingDrawing" xmlns:wp="http://schemas.openxmlformats.org/drawingml/2006/wordprocessingDrawing" xmlns:wpg="http://schemas.microsoft.com/office/word/2010/wordprocessingGroup" xmlns:wpi="http://schemas.microsoft.com/office/word/2010/wordprocessingInk" xmlns:wps="http://schemas.microsoft.com/office/word/2010/wordprocessingShape" xmlns:o="urn:schemas-microsoft-com:office:office" xmlns:v="urn:schemas-microsoft-com:vml" xmlns:w10="urn:schemas-microsoft-com:office:word" xmlns:w="http://schemas.openxmlformats.org/wordprocessingml/2006/main" xmlns:w14="http://schemas.microsoft.com/office/word/2010/wordml" xmlns:w15="http://schemas.microsoft.com/office/word/2012/wordml" xmlns:w16cex="http://schemas.microsoft.com/office/word/2018/wordml/cex" xmlns:w16cid="http://schemas.microsoft.com/office/word/2016/wordml/cid" xmlns:w16="http://schemas.microsoft.com/office/word/2018/wordml" xmlns:w16sdtdh="http://schemas.microsoft.com/office/word/2020/wordml/sdtdatahash" xmlns:w16sdtfl="http://schemas.microsoft.com/office/word/2024/wordml/sdtformatlock" xmlns:w16se="http://schemas.microsoft.com/office/word/2015/wordml/symex" xmlns:w16du="http://schemas.microsoft.com/office/word/2023/wordml/word16du" xmlns:wne="http://schemas.microsoft.com/office/word/2006/wordml" mc:Ignorable="w14 w15 w16se w16cid w16 w16cex w16sdtdh w16sdtfl w16du wp14">
+<w:numbering xmlns:wpc="http://schemas.microsoft.com/office/word/2010/wordprocessingCanvas" xmlns:cx="http://schemas.microsoft.com/office/drawing/2014/chartex" xmlns:cx1="http://schemas.microsoft.com/office/drawing/2015/9/8/chartex" xmlns:cx2="http://schemas.microsoft.com/office/drawing/2015/10/21/chartex" xmlns:cx3="http://schemas.microsoft.com/office/drawing/2016/5/9/chartex" xmlns:cx4="http://schemas.microsoft.com/office/drawing/2016/5/10/chartex" xmlns:cx5="http://schemas.microsoft.com/office/drawing/2016/5/11/chartex" xmlns:cx6="http://schemas.microsoft.com/office/drawing/2016/5/12/chartex" xmlns:cx7="http://schemas.microsoft.com/office/drawing/2016/5/13/chartex" xmlns:cx8="http://schemas.microsoft.com/office/drawing/2016/5/14/chartex" xmlns:mc="http://schemas.openxmlformats.org/markup-compatibility/2006" xmlns:aink="http://schemas.microsoft.com/office/drawing/2016/ink" xmlns:am3d="http://schemas.microsoft.com/office/drawing/2017/model3d" xmlns:o="urn:schemas-microsoft-com:office:office" xmlns:oel="http://schemas.microsoft.com/office/2019/extlst" xmlns:r="http://schemas.openxmlformats.org/officeDocument/2006/relationships" xmlns:m="http://schemas.openxmlformats.org/officeDocument/2006/math" xmlns:v="urn:schemas-microsoft-com:vml" xmlns:wp14="http://schemas.microsoft.com/office/word/2010/wordprocessingDrawing" xmlns:wp="http://schemas.openxmlformats.org/drawingml/2006/wordprocessingDrawing" xmlns:w10="urn:schemas-microsoft-com:office:word" xmlns:w="http://schemas.openxmlformats.org/wordprocessingml/2006/main" xmlns:w14="http://schemas.microsoft.com/office/word/2010/wordml" xmlns:w15="http://schemas.microsoft.com/office/word/2012/wordml" xmlns:w16cex="http://schemas.microsoft.com/office/word/2018/wordml/cex" xmlns:w16cid="http://schemas.microsoft.com/office/word/2016/wordml/cid" xmlns:w16="http://schemas.microsoft.com/office/word/2018/wordml" xmlns:w16du="http://schemas.microsoft.com/office/word/2023/wordml/word16du" xmlns:w16sdtdh="http://schemas.microsoft.com/office/word/2020/wordml/sdtdatahash" xmlns:w16sdtfl="http://schemas.microsoft.com/office/word/2024/wordml/sdtformatlock" xmlns:w16se="http://schemas.microsoft.com/office/word/2015/wordml/symex" xmlns:wpg="http://schemas.microsoft.com/office/word/2010/wordprocessingGroup" xmlns:wpi="http://schemas.microsoft.com/office/word/2010/wordprocessingInk" xmlns:wne="http://schemas.microsoft.com/office/word/2006/wordml" xmlns:wps="http://schemas.microsoft.com/office/word/2010/wordprocessingShape" mc:Ignorable="w14 w15 w16se w16cid w16 w16cex w16sdtdh w16sdtfl w16du wp14">
   <w:abstractNum w:abstractNumId="0" w15:restartNumberingAfterBreak="0">
     <w:nsid w:val="0835130A"/>
     <w:multiLevelType w:val="multilevel"/>
@@ -14124,7 +14243,7 @@
 </file>
 
 <file path=word/styles.xml><?xml version="1.0" encoding="utf-8"?>
-<w:styles xmlns:mc="http://schemas.openxmlformats.org/markup-compatibility/2006" xmlns:r="http://schemas.openxmlformats.org/officeDocument/2006/relationships" xmlns:w="http://schemas.openxmlformats.org/wordprocessingml/2006/main" xmlns:w14="http://schemas.microsoft.com/office/word/2010/wordml" xmlns:w15="http://schemas.microsoft.com/office/word/2012/wordml" xmlns:w16cex="http://schemas.microsoft.com/office/word/2018/wordml/cex" xmlns:w16cid="http://schemas.microsoft.com/office/word/2016/wordml/cid" xmlns:w16="http://schemas.microsoft.com/office/word/2018/wordml" xmlns:w16sdtdh="http://schemas.microsoft.com/office/word/2020/wordml/sdtdatahash" xmlns:w16sdtfl="http://schemas.microsoft.com/office/word/2024/wordml/sdtformatlock" xmlns:w16se="http://schemas.microsoft.com/office/word/2015/wordml/symex" xmlns:w16du="http://schemas.microsoft.com/office/word/2023/wordml/word16du" mc:Ignorable="w14 w15 w16se w16cid w16 w16cex w16sdtdh w16sdtfl w16du">
+<w:styles xmlns:mc="http://schemas.openxmlformats.org/markup-compatibility/2006" xmlns:r="http://schemas.openxmlformats.org/officeDocument/2006/relationships" xmlns:w="http://schemas.openxmlformats.org/wordprocessingml/2006/main" xmlns:w14="http://schemas.microsoft.com/office/word/2010/wordml" xmlns:w15="http://schemas.microsoft.com/office/word/2012/wordml" xmlns:w16cex="http://schemas.microsoft.com/office/word/2018/wordml/cex" xmlns:w16cid="http://schemas.microsoft.com/office/word/2016/wordml/cid" xmlns:w16="http://schemas.microsoft.com/office/word/2018/wordml" xmlns:w16du="http://schemas.microsoft.com/office/word/2023/wordml/word16du" xmlns:w16sdtdh="http://schemas.microsoft.com/office/word/2020/wordml/sdtdatahash" xmlns:w16sdtfl="http://schemas.microsoft.com/office/word/2024/wordml/sdtformatlock" xmlns:w16se="http://schemas.microsoft.com/office/word/2015/wordml/symex" mc:Ignorable="w14 w15 w16se w16cid w16 w16cex w16sdtdh w16sdtfl w16du">
   <w:docDefaults>
     <w:rPrDefault>
       <w:rPr>
@@ -14747,6 +14866,7 @@
   <w:style w:type="character" w:default="1" w:styleId="DefaultParagraphFont">
     <w:name w:val="Default Paragraph Font"/>
     <w:uiPriority w:val="1"/>
+    <w:semiHidden/>
     <w:unhideWhenUsed/>
   </w:style>
   <w:style w:type="table" w:default="1" w:styleId="TableNormal">

</xml_diff>